<commit_message>
edit dikit form seminar hasil
</commit_message>
<xml_diff>
--- a/templates_surat/seminar_hasil.docx
+++ b/templates_surat/seminar_hasil.docx
@@ -351,35 +351,14 @@
         <w:tab/>
       </w:r>
       <w:r>
-        <w:t>Hari/</w:t>
-      </w:r>
-      <w:proofErr w:type="spellStart"/>
-      <w:r>
-        <w:t>Tgl</w:t>
-      </w:r>
-      <w:proofErr w:type="spellEnd"/>
+        <w:t>Hari/Tgl</w:t>
+      </w:r>
       <w:r>
         <w:tab/>
         <w:t xml:space="preserve">: </w:t>
       </w:r>
       <w:r>
-        <w:t>{{</w:t>
-      </w:r>
-      <w:proofErr w:type="spellStart"/>
-      <w:r>
-        <w:t>hari</w:t>
-      </w:r>
-      <w:proofErr w:type="spellEnd"/>
-      <w:r>
-        <w:t>}}, {{</w:t>
-      </w:r>
-      <w:proofErr w:type="spellStart"/>
-      <w:r>
-        <w:t>tgl</w:t>
-      </w:r>
-      <w:proofErr w:type="spellEnd"/>
-      <w:r>
-        <w:t>}}</w:t>
+        <w:t>{{hari}}, {{tgl}}</w:t>
       </w:r>
     </w:p>
     <w:p>
@@ -410,15 +389,7 @@
         <w:t xml:space="preserve">: </w:t>
       </w:r>
       <w:r>
-        <w:t>{{</w:t>
-      </w:r>
-      <w:proofErr w:type="spellStart"/>
-      <w:r>
-        <w:t>npm</w:t>
-      </w:r>
-      <w:proofErr w:type="spellEnd"/>
-      <w:r>
-        <w:t>}}</w:t>
+        <w:t>{{npm}}</w:t>
       </w:r>
       <w:r>
         <w:tab/>
@@ -437,21 +408,8 @@
         <w:t>{{jam}}</w:t>
       </w:r>
       <w:r>
-        <w:t xml:space="preserve"> </w:t>
-      </w:r>
-      <w:proofErr w:type="spellStart"/>
-      <w:r>
-        <w:t>Wib</w:t>
-      </w:r>
-      <w:proofErr w:type="spellEnd"/>
-      <w:r>
-        <w:t xml:space="preserve"> s/d </w:t>
-      </w:r>
-      <w:proofErr w:type="spellStart"/>
-      <w:r>
-        <w:t>selesai</w:t>
-      </w:r>
-      <w:proofErr w:type="spellEnd"/>
+        <w:t xml:space="preserve"> Wib s/d selesai</w:t>
+      </w:r>
     </w:p>
     <w:p>
       <w:pPr>
@@ -521,45 +479,34 @@
                 <w:bCs/>
               </w:rPr>
             </w:pPr>
-            <w:proofErr w:type="spellStart"/>
             <w:r>
               <w:rPr>
                 <w:b/>
                 <w:bCs/>
               </w:rPr>
-              <w:t>Unsur</w:t>
-            </w:r>
-            <w:proofErr w:type="spellEnd"/>
-            <w:r>
+              <w:t>Unsur Yang Dinilai</w:t>
+            </w:r>
+          </w:p>
+        </w:tc>
+        <w:tc>
+          <w:tcPr>
+            <w:tcW w:w="1080" w:type="dxa"/>
+          </w:tcPr>
+          <w:p>
+            <w:pPr>
+              <w:jc w:val="center"/>
               <w:rPr>
                 <w:b/>
                 <w:bCs/>
               </w:rPr>
-              <w:t xml:space="preserve"> Yang Dinilai</w:t>
-            </w:r>
-          </w:p>
-        </w:tc>
-        <w:tc>
-          <w:tcPr>
-            <w:tcW w:w="1080" w:type="dxa"/>
-          </w:tcPr>
-          <w:p>
-            <w:pPr>
-              <w:jc w:val="center"/>
+            </w:pPr>
+            <w:r>
               <w:rPr>
                 <w:b/>
                 <w:bCs/>
               </w:rPr>
-            </w:pPr>
-            <w:proofErr w:type="spellStart"/>
-            <w:r>
-              <w:rPr>
-                <w:b/>
-                <w:bCs/>
-              </w:rPr>
               <w:t>Bobot</w:t>
             </w:r>
-            <w:proofErr w:type="spellEnd"/>
           </w:p>
           <w:p>
             <w:pPr>
@@ -727,40 +674,23 @@
               <w:pStyle w:val="Heading9"/>
             </w:pPr>
             <w:r>
-              <w:t xml:space="preserve">Materi Seminar </w:t>
-            </w:r>
-            <w:proofErr w:type="spellStart"/>
-            <w:r>
-              <w:t>Penelitian</w:t>
-            </w:r>
-            <w:proofErr w:type="spellEnd"/>
-          </w:p>
-          <w:p>
-            <w:r>
-              <w:t xml:space="preserve">Latar </w:t>
-            </w:r>
-            <w:proofErr w:type="spellStart"/>
-            <w:r>
-              <w:t>Belakang</w:t>
-            </w:r>
-            <w:proofErr w:type="spellEnd"/>
-          </w:p>
-          <w:p>
-            <w:proofErr w:type="spellStart"/>
+              <w:t>Materi Seminar Penelitian</w:t>
+            </w:r>
+          </w:p>
+          <w:p>
+            <w:r>
+              <w:t>Latar Belakang</w:t>
+            </w:r>
+          </w:p>
+          <w:p>
             <w:r>
               <w:t>Metodologi</w:t>
             </w:r>
-            <w:proofErr w:type="spellEnd"/>
-          </w:p>
-          <w:p>
-            <w:r>
-              <w:t xml:space="preserve">Hasil dan </w:t>
-            </w:r>
-            <w:proofErr w:type="spellStart"/>
-            <w:r>
-              <w:t>Pembahasan</w:t>
-            </w:r>
-            <w:proofErr w:type="spellEnd"/>
+          </w:p>
+          <w:p>
+            <w:r>
+              <w:t>Hasil dan Pembahasan</w:t>
+            </w:r>
           </w:p>
           <w:p>
             <w:r>
@@ -978,51 +908,24 @@
             <w:pPr>
               <w:pStyle w:val="Heading9"/>
             </w:pPr>
-            <w:proofErr w:type="spellStart"/>
             <w:r>
               <w:t>Diskusi</w:t>
             </w:r>
-            <w:proofErr w:type="spellEnd"/>
-          </w:p>
-          <w:p>
-            <w:proofErr w:type="spellStart"/>
-            <w:r>
-              <w:t>Penguasaan</w:t>
-            </w:r>
-            <w:proofErr w:type="spellEnd"/>
-            <w:r>
-              <w:t xml:space="preserve"> Materi Seminar</w:t>
-            </w:r>
-          </w:p>
-          <w:p>
-            <w:proofErr w:type="spellStart"/>
+          </w:p>
+          <w:p>
+            <w:r>
+              <w:t>Penguasaan Materi Seminar</w:t>
+            </w:r>
+          </w:p>
+          <w:p>
             <w:r>
               <w:t>Kemampuan</w:t>
             </w:r>
-            <w:proofErr w:type="spellEnd"/>
-          </w:p>
-          <w:p>
-            <w:proofErr w:type="spellStart"/>
-            <w:r>
-              <w:t>Menjawab</w:t>
-            </w:r>
-            <w:proofErr w:type="spellEnd"/>
-            <w:r>
-              <w:t>/</w:t>
-            </w:r>
-            <w:proofErr w:type="spellStart"/>
-            <w:r>
-              <w:t>menjelaskan</w:t>
-            </w:r>
-            <w:proofErr w:type="spellEnd"/>
-            <w:r>
-              <w:t>/</w:t>
-            </w:r>
-            <w:proofErr w:type="spellStart"/>
-            <w:r>
-              <w:t>Argumentasi</w:t>
-            </w:r>
-            <w:proofErr w:type="spellEnd"/>
+          </w:p>
+          <w:p>
+            <w:r>
+              <w:t>Menjawab/menjelaskan/Argumentasi</w:t>
+            </w:r>
           </w:p>
           <w:p/>
         </w:tc>
@@ -1174,44 +1077,19 @@
             <w:pPr>
               <w:pStyle w:val="Heading9"/>
             </w:pPr>
-            <w:proofErr w:type="spellStart"/>
             <w:r>
               <w:t>Presentasi</w:t>
             </w:r>
-            <w:proofErr w:type="spellEnd"/>
-          </w:p>
-          <w:p>
-            <w:proofErr w:type="spellStart"/>
-            <w:r>
-              <w:t>Kemampuan</w:t>
-            </w:r>
-            <w:proofErr w:type="spellEnd"/>
-            <w:r>
-              <w:t xml:space="preserve"> </w:t>
-            </w:r>
-            <w:proofErr w:type="spellStart"/>
-            <w:r>
-              <w:t>Menyajikan</w:t>
-            </w:r>
-            <w:proofErr w:type="spellEnd"/>
-            <w:r>
-              <w:t xml:space="preserve"> Seminar</w:t>
-            </w:r>
-          </w:p>
-          <w:p>
-            <w:proofErr w:type="spellStart"/>
-            <w:r>
-              <w:t>Sikap</w:t>
-            </w:r>
-            <w:proofErr w:type="spellEnd"/>
-            <w:r>
-              <w:t xml:space="preserve"> dan Sopan </w:t>
-            </w:r>
-            <w:proofErr w:type="spellStart"/>
-            <w:r>
-              <w:t>Santun</w:t>
-            </w:r>
-            <w:proofErr w:type="spellEnd"/>
+          </w:p>
+          <w:p>
+            <w:r>
+              <w:t>Kemampuan Menyajikan Seminar</w:t>
+            </w:r>
+          </w:p>
+          <w:p>
+            <w:r>
+              <w:t>Sikap dan Sopan Santun</w:t>
+            </w:r>
           </w:p>
           <w:p/>
         </w:tc>
@@ -1431,11 +1309,9 @@
       <w:r>
         <w:t xml:space="preserve">Dosen </w:t>
       </w:r>
-      <w:proofErr w:type="spellStart"/>
-      <w:r>
-        <w:t>Penguji</w:t>
-      </w:r>
-      <w:proofErr w:type="spellEnd"/>
+      <w:r>
+        <w:t>Pembimbing</w:t>
+      </w:r>
       <w:r>
         <w:t>,</w:t>
       </w:r>
@@ -1465,7 +1341,7 @@
         <w:t>{{</w:t>
       </w:r>
       <w:r>
-        <w:t>doji1</w:t>
+        <w:t>doping</w:t>
       </w:r>
       <w:r>
         <w:t>}}</w:t>
@@ -1881,32 +1757,11 @@
       </w:r>
       <w:r>
         <w:tab/>
-        <w:t>Hari/</w:t>
-      </w:r>
-      <w:proofErr w:type="spellStart"/>
-      <w:r>
-        <w:t>Tgl</w:t>
-      </w:r>
-      <w:proofErr w:type="spellEnd"/>
-      <w:r>
-        <w:tab/>
-        <w:t>: {{</w:t>
-      </w:r>
-      <w:proofErr w:type="spellStart"/>
-      <w:r>
-        <w:t>hari</w:t>
-      </w:r>
-      <w:proofErr w:type="spellEnd"/>
-      <w:r>
-        <w:t>}}, {{</w:t>
-      </w:r>
-      <w:proofErr w:type="spellStart"/>
-      <w:r>
-        <w:t>tgl</w:t>
-      </w:r>
-      <w:proofErr w:type="spellEnd"/>
-      <w:r>
-        <w:t>}}</w:t>
+        <w:t>Hari/Tgl</w:t>
+      </w:r>
+      <w:r>
+        <w:tab/>
+        <w:t>: {{hari}}, {{tgl}}</w:t>
       </w:r>
     </w:p>
     <w:p>
@@ -1931,15 +1786,7 @@
       </w:r>
       <w:r>
         <w:tab/>
-        <w:t xml:space="preserve"> : {{</w:t>
-      </w:r>
-      <w:proofErr w:type="spellStart"/>
-      <w:r>
-        <w:t>npm</w:t>
-      </w:r>
-      <w:proofErr w:type="spellEnd"/>
-      <w:r>
-        <w:t>}}</w:t>
+        <w:t xml:space="preserve"> : {{npm}}</w:t>
       </w:r>
       <w:r>
         <w:tab/>
@@ -1950,21 +1797,8 @@
       </w:r>
       <w:r>
         <w:tab/>
-        <w:t xml:space="preserve">: {{jam}} </w:t>
-      </w:r>
-      <w:proofErr w:type="spellStart"/>
-      <w:r>
-        <w:t>Wib</w:t>
-      </w:r>
-      <w:proofErr w:type="spellEnd"/>
-      <w:r>
-        <w:t xml:space="preserve"> s/d </w:t>
-      </w:r>
-      <w:proofErr w:type="spellStart"/>
-      <w:r>
-        <w:t>selesai</w:t>
-      </w:r>
-      <w:proofErr w:type="spellEnd"/>
+        <w:t>: {{jam}} Wib s/d selesai</w:t>
+      </w:r>
     </w:p>
     <w:p>
       <w:pPr>
@@ -2034,45 +1868,34 @@
                 <w:bCs/>
               </w:rPr>
             </w:pPr>
-            <w:proofErr w:type="spellStart"/>
             <w:r>
               <w:rPr>
                 <w:b/>
                 <w:bCs/>
               </w:rPr>
-              <w:t>Unsur</w:t>
-            </w:r>
-            <w:proofErr w:type="spellEnd"/>
-            <w:r>
+              <w:t>Unsur Yang Dinilai</w:t>
+            </w:r>
+          </w:p>
+        </w:tc>
+        <w:tc>
+          <w:tcPr>
+            <w:tcW w:w="1080" w:type="dxa"/>
+          </w:tcPr>
+          <w:p>
+            <w:pPr>
+              <w:jc w:val="center"/>
               <w:rPr>
                 <w:b/>
                 <w:bCs/>
               </w:rPr>
-              <w:t xml:space="preserve"> Yang Dinilai</w:t>
-            </w:r>
-          </w:p>
-        </w:tc>
-        <w:tc>
-          <w:tcPr>
-            <w:tcW w:w="1080" w:type="dxa"/>
-          </w:tcPr>
-          <w:p>
-            <w:pPr>
-              <w:jc w:val="center"/>
+            </w:pPr>
+            <w:r>
               <w:rPr>
                 <w:b/>
                 <w:bCs/>
               </w:rPr>
-            </w:pPr>
-            <w:proofErr w:type="spellStart"/>
-            <w:r>
-              <w:rPr>
-                <w:b/>
-                <w:bCs/>
-              </w:rPr>
               <w:t>Bobot</w:t>
             </w:r>
-            <w:proofErr w:type="spellEnd"/>
           </w:p>
           <w:p>
             <w:pPr>
@@ -2240,40 +2063,23 @@
               <w:pStyle w:val="Heading9"/>
             </w:pPr>
             <w:r>
-              <w:t xml:space="preserve">Materi Seminar </w:t>
-            </w:r>
-            <w:proofErr w:type="spellStart"/>
-            <w:r>
-              <w:t>Penelitian</w:t>
-            </w:r>
-            <w:proofErr w:type="spellEnd"/>
-          </w:p>
-          <w:p>
-            <w:r>
-              <w:t xml:space="preserve">Latar </w:t>
-            </w:r>
-            <w:proofErr w:type="spellStart"/>
-            <w:r>
-              <w:t>Belakang</w:t>
-            </w:r>
-            <w:proofErr w:type="spellEnd"/>
-          </w:p>
-          <w:p>
-            <w:proofErr w:type="spellStart"/>
+              <w:t>Materi Seminar Penelitian</w:t>
+            </w:r>
+          </w:p>
+          <w:p>
+            <w:r>
+              <w:t>Latar Belakang</w:t>
+            </w:r>
+          </w:p>
+          <w:p>
             <w:r>
               <w:t>Metodologi</w:t>
             </w:r>
-            <w:proofErr w:type="spellEnd"/>
-          </w:p>
-          <w:p>
-            <w:r>
-              <w:t xml:space="preserve">Hasil dan </w:t>
-            </w:r>
-            <w:proofErr w:type="spellStart"/>
-            <w:r>
-              <w:t>Pembahasan</w:t>
-            </w:r>
-            <w:proofErr w:type="spellEnd"/>
+          </w:p>
+          <w:p>
+            <w:r>
+              <w:t>Hasil dan Pembahasan</w:t>
+            </w:r>
           </w:p>
           <w:p>
             <w:r>
@@ -2491,51 +2297,24 @@
             <w:pPr>
               <w:pStyle w:val="Heading9"/>
             </w:pPr>
-            <w:proofErr w:type="spellStart"/>
             <w:r>
               <w:t>Diskusi</w:t>
             </w:r>
-            <w:proofErr w:type="spellEnd"/>
-          </w:p>
-          <w:p>
-            <w:proofErr w:type="spellStart"/>
-            <w:r>
-              <w:t>Penguasaan</w:t>
-            </w:r>
-            <w:proofErr w:type="spellEnd"/>
-            <w:r>
-              <w:t xml:space="preserve"> Materi Seminar</w:t>
-            </w:r>
-          </w:p>
-          <w:p>
-            <w:proofErr w:type="spellStart"/>
+          </w:p>
+          <w:p>
+            <w:r>
+              <w:t>Penguasaan Materi Seminar</w:t>
+            </w:r>
+          </w:p>
+          <w:p>
             <w:r>
               <w:t>Kemampuan</w:t>
             </w:r>
-            <w:proofErr w:type="spellEnd"/>
-          </w:p>
-          <w:p>
-            <w:proofErr w:type="spellStart"/>
-            <w:r>
-              <w:t>Menjawab</w:t>
-            </w:r>
-            <w:proofErr w:type="spellEnd"/>
-            <w:r>
-              <w:t>/</w:t>
-            </w:r>
-            <w:proofErr w:type="spellStart"/>
-            <w:r>
-              <w:t>menjelaskan</w:t>
-            </w:r>
-            <w:proofErr w:type="spellEnd"/>
-            <w:r>
-              <w:t>/</w:t>
-            </w:r>
-            <w:proofErr w:type="spellStart"/>
-            <w:r>
-              <w:t>Argumentasi</w:t>
-            </w:r>
-            <w:proofErr w:type="spellEnd"/>
+          </w:p>
+          <w:p>
+            <w:r>
+              <w:t>Menjawab/menjelaskan/Argumentasi</w:t>
+            </w:r>
           </w:p>
           <w:p/>
         </w:tc>
@@ -2687,44 +2466,19 @@
             <w:pPr>
               <w:pStyle w:val="Heading9"/>
             </w:pPr>
-            <w:proofErr w:type="spellStart"/>
             <w:r>
               <w:t>Presentasi</w:t>
             </w:r>
-            <w:proofErr w:type="spellEnd"/>
-          </w:p>
-          <w:p>
-            <w:proofErr w:type="spellStart"/>
-            <w:r>
-              <w:t>Kemampuan</w:t>
-            </w:r>
-            <w:proofErr w:type="spellEnd"/>
-            <w:r>
-              <w:t xml:space="preserve"> </w:t>
-            </w:r>
-            <w:proofErr w:type="spellStart"/>
-            <w:r>
-              <w:t>Menyajikan</w:t>
-            </w:r>
-            <w:proofErr w:type="spellEnd"/>
-            <w:r>
-              <w:t xml:space="preserve"> Seminar</w:t>
-            </w:r>
-          </w:p>
-          <w:p>
-            <w:proofErr w:type="spellStart"/>
-            <w:r>
-              <w:t>Sikap</w:t>
-            </w:r>
-            <w:proofErr w:type="spellEnd"/>
-            <w:r>
-              <w:t xml:space="preserve"> dan Sopan </w:t>
-            </w:r>
-            <w:proofErr w:type="spellStart"/>
-            <w:r>
-              <w:t>Santun</w:t>
-            </w:r>
-            <w:proofErr w:type="spellEnd"/>
+          </w:p>
+          <w:p>
+            <w:r>
+              <w:t>Kemampuan Menyajikan Seminar</w:t>
+            </w:r>
+          </w:p>
+          <w:p>
+            <w:r>
+              <w:t>Sikap dan Sopan Santun</w:t>
+            </w:r>
           </w:p>
           <w:p/>
         </w:tc>
@@ -2922,15 +2676,7 @@
         <w:ind w:left="5040" w:firstLine="720"/>
       </w:pPr>
       <w:r>
-        <w:t xml:space="preserve">Dosen </w:t>
-      </w:r>
-      <w:proofErr w:type="spellStart"/>
-      <w:r>
-        <w:t>Penguji</w:t>
-      </w:r>
-      <w:proofErr w:type="spellEnd"/>
-      <w:r>
-        <w:t>,</w:t>
+        <w:t>Dosen Penguji,</w:t>
       </w:r>
     </w:p>
     <w:p>
@@ -2985,7 +2731,7 @@
         <w:t>{{doji</w:t>
       </w:r>
       <w:r>
-        <w:t>2</w:t>
+        <w:t>1</w:t>
       </w:r>
       <w:r>
         <w:t>}}</w:t>
@@ -3388,32 +3134,11 @@
       </w:r>
       <w:r>
         <w:tab/>
-        <w:t>Hari/</w:t>
-      </w:r>
-      <w:proofErr w:type="spellStart"/>
-      <w:r>
-        <w:t>Tgl</w:t>
-      </w:r>
-      <w:proofErr w:type="spellEnd"/>
-      <w:r>
-        <w:tab/>
-        <w:t>: {{</w:t>
-      </w:r>
-      <w:proofErr w:type="spellStart"/>
-      <w:r>
-        <w:t>hari</w:t>
-      </w:r>
-      <w:proofErr w:type="spellEnd"/>
-      <w:r>
-        <w:t>}}, {{</w:t>
-      </w:r>
-      <w:proofErr w:type="spellStart"/>
-      <w:r>
-        <w:t>tgl</w:t>
-      </w:r>
-      <w:proofErr w:type="spellEnd"/>
-      <w:r>
-        <w:t>}}</w:t>
+        <w:t>Hari/Tgl</w:t>
+      </w:r>
+      <w:r>
+        <w:tab/>
+        <w:t>: {{hari}}, {{tgl}}</w:t>
       </w:r>
     </w:p>
     <w:p>
@@ -3438,15 +3163,7 @@
       </w:r>
       <w:r>
         <w:tab/>
-        <w:t xml:space="preserve"> : {{</w:t>
-      </w:r>
-      <w:proofErr w:type="spellStart"/>
-      <w:r>
-        <w:t>npm</w:t>
-      </w:r>
-      <w:proofErr w:type="spellEnd"/>
-      <w:r>
-        <w:t>}}</w:t>
+        <w:t xml:space="preserve"> : {{npm}}</w:t>
       </w:r>
       <w:r>
         <w:tab/>
@@ -3457,21 +3174,8 @@
       </w:r>
       <w:r>
         <w:tab/>
-        <w:t xml:space="preserve">: {{jam}} </w:t>
-      </w:r>
-      <w:proofErr w:type="spellStart"/>
-      <w:r>
-        <w:t>Wib</w:t>
-      </w:r>
-      <w:proofErr w:type="spellEnd"/>
-      <w:r>
-        <w:t xml:space="preserve"> s/d </w:t>
-      </w:r>
-      <w:proofErr w:type="spellStart"/>
-      <w:r>
-        <w:t>selesai</w:t>
-      </w:r>
-      <w:proofErr w:type="spellEnd"/>
+        <w:t>: {{jam}} Wib s/d selesai</w:t>
+      </w:r>
     </w:p>
     <w:p>
       <w:pPr>
@@ -3541,45 +3245,34 @@
                 <w:bCs/>
               </w:rPr>
             </w:pPr>
-            <w:proofErr w:type="spellStart"/>
             <w:r>
               <w:rPr>
                 <w:b/>
                 <w:bCs/>
               </w:rPr>
-              <w:t>Unsur</w:t>
-            </w:r>
-            <w:proofErr w:type="spellEnd"/>
-            <w:r>
+              <w:t>Unsur Yang Dinilai</w:t>
+            </w:r>
+          </w:p>
+        </w:tc>
+        <w:tc>
+          <w:tcPr>
+            <w:tcW w:w="1080" w:type="dxa"/>
+          </w:tcPr>
+          <w:p>
+            <w:pPr>
+              <w:jc w:val="center"/>
               <w:rPr>
                 <w:b/>
                 <w:bCs/>
               </w:rPr>
-              <w:t xml:space="preserve"> Yang Dinilai</w:t>
-            </w:r>
-          </w:p>
-        </w:tc>
-        <w:tc>
-          <w:tcPr>
-            <w:tcW w:w="1080" w:type="dxa"/>
-          </w:tcPr>
-          <w:p>
-            <w:pPr>
-              <w:jc w:val="center"/>
+            </w:pPr>
+            <w:r>
               <w:rPr>
                 <w:b/>
                 <w:bCs/>
               </w:rPr>
-            </w:pPr>
-            <w:proofErr w:type="spellStart"/>
-            <w:r>
-              <w:rPr>
-                <w:b/>
-                <w:bCs/>
-              </w:rPr>
               <w:t>Bobot</w:t>
             </w:r>
-            <w:proofErr w:type="spellEnd"/>
           </w:p>
           <w:p>
             <w:pPr>
@@ -3747,40 +3440,23 @@
               <w:pStyle w:val="Heading9"/>
             </w:pPr>
             <w:r>
-              <w:t xml:space="preserve">Materi Seminar </w:t>
-            </w:r>
-            <w:proofErr w:type="spellStart"/>
-            <w:r>
-              <w:t>Penelitian</w:t>
-            </w:r>
-            <w:proofErr w:type="spellEnd"/>
-          </w:p>
-          <w:p>
-            <w:r>
-              <w:t xml:space="preserve">Latar </w:t>
-            </w:r>
-            <w:proofErr w:type="spellStart"/>
-            <w:r>
-              <w:t>Belakang</w:t>
-            </w:r>
-            <w:proofErr w:type="spellEnd"/>
-          </w:p>
-          <w:p>
-            <w:proofErr w:type="spellStart"/>
+              <w:t>Materi Seminar Penelitian</w:t>
+            </w:r>
+          </w:p>
+          <w:p>
+            <w:r>
+              <w:t>Latar Belakang</w:t>
+            </w:r>
+          </w:p>
+          <w:p>
             <w:r>
               <w:t>Metodologi</w:t>
             </w:r>
-            <w:proofErr w:type="spellEnd"/>
-          </w:p>
-          <w:p>
-            <w:r>
-              <w:t xml:space="preserve">Hasil dan </w:t>
-            </w:r>
-            <w:proofErr w:type="spellStart"/>
-            <w:r>
-              <w:t>Pembahasan</w:t>
-            </w:r>
-            <w:proofErr w:type="spellEnd"/>
+          </w:p>
+          <w:p>
+            <w:r>
+              <w:t>Hasil dan Pembahasan</w:t>
+            </w:r>
           </w:p>
           <w:p>
             <w:r>
@@ -3998,51 +3674,24 @@
             <w:pPr>
               <w:pStyle w:val="Heading9"/>
             </w:pPr>
-            <w:proofErr w:type="spellStart"/>
             <w:r>
               <w:t>Diskusi</w:t>
             </w:r>
-            <w:proofErr w:type="spellEnd"/>
-          </w:p>
-          <w:p>
-            <w:proofErr w:type="spellStart"/>
-            <w:r>
-              <w:t>Penguasaan</w:t>
-            </w:r>
-            <w:proofErr w:type="spellEnd"/>
-            <w:r>
-              <w:t xml:space="preserve"> Materi Seminar</w:t>
-            </w:r>
-          </w:p>
-          <w:p>
-            <w:proofErr w:type="spellStart"/>
+          </w:p>
+          <w:p>
+            <w:r>
+              <w:t>Penguasaan Materi Seminar</w:t>
+            </w:r>
+          </w:p>
+          <w:p>
             <w:r>
               <w:t>Kemampuan</w:t>
             </w:r>
-            <w:proofErr w:type="spellEnd"/>
-          </w:p>
-          <w:p>
-            <w:proofErr w:type="spellStart"/>
-            <w:r>
-              <w:t>Menjawab</w:t>
-            </w:r>
-            <w:proofErr w:type="spellEnd"/>
-            <w:r>
-              <w:t>/</w:t>
-            </w:r>
-            <w:proofErr w:type="spellStart"/>
-            <w:r>
-              <w:t>menjelaskan</w:t>
-            </w:r>
-            <w:proofErr w:type="spellEnd"/>
-            <w:r>
-              <w:t>/</w:t>
-            </w:r>
-            <w:proofErr w:type="spellStart"/>
-            <w:r>
-              <w:t>Argumentasi</w:t>
-            </w:r>
-            <w:proofErr w:type="spellEnd"/>
+          </w:p>
+          <w:p>
+            <w:r>
+              <w:t>Menjawab/menjelaskan/Argumentasi</w:t>
+            </w:r>
           </w:p>
           <w:p/>
         </w:tc>
@@ -4194,44 +3843,19 @@
             <w:pPr>
               <w:pStyle w:val="Heading9"/>
             </w:pPr>
-            <w:proofErr w:type="spellStart"/>
             <w:r>
               <w:t>Presentasi</w:t>
             </w:r>
-            <w:proofErr w:type="spellEnd"/>
-          </w:p>
-          <w:p>
-            <w:proofErr w:type="spellStart"/>
-            <w:r>
-              <w:t>Kemampuan</w:t>
-            </w:r>
-            <w:proofErr w:type="spellEnd"/>
-            <w:r>
-              <w:t xml:space="preserve"> </w:t>
-            </w:r>
-            <w:proofErr w:type="spellStart"/>
-            <w:r>
-              <w:t>Menyajikan</w:t>
-            </w:r>
-            <w:proofErr w:type="spellEnd"/>
-            <w:r>
-              <w:t xml:space="preserve"> Seminar</w:t>
-            </w:r>
-          </w:p>
-          <w:p>
-            <w:proofErr w:type="spellStart"/>
-            <w:r>
-              <w:t>Sikap</w:t>
-            </w:r>
-            <w:proofErr w:type="spellEnd"/>
-            <w:r>
-              <w:t xml:space="preserve"> dan Sopan </w:t>
-            </w:r>
-            <w:proofErr w:type="spellStart"/>
-            <w:r>
-              <w:t>Santun</w:t>
-            </w:r>
-            <w:proofErr w:type="spellEnd"/>
+          </w:p>
+          <w:p>
+            <w:r>
+              <w:t>Kemampuan Menyajikan Seminar</w:t>
+            </w:r>
+          </w:p>
+          <w:p>
+            <w:r>
+              <w:t>Sikap dan Sopan Santun</w:t>
+            </w:r>
           </w:p>
           <w:p/>
         </w:tc>
@@ -4424,15 +4048,7 @@
         <w:ind w:left="5040"/>
       </w:pPr>
       <w:r>
-        <w:t xml:space="preserve">Dosen </w:t>
-      </w:r>
-      <w:proofErr w:type="spellStart"/>
-      <w:r>
-        <w:t>Penguji</w:t>
-      </w:r>
-      <w:proofErr w:type="spellEnd"/>
-      <w:r>
-        <w:t>,</w:t>
+        <w:t>Dosen Penguji,</w:t>
       </w:r>
     </w:p>
     <w:p>
@@ -4493,7 +4109,7 @@
         <w:t>{{doji</w:t>
       </w:r>
       <w:r>
-        <w:t>3</w:t>
+        <w:t>2</w:t>
       </w:r>
       <w:r>
         <w:t>}}</w:t>
@@ -4891,32 +4507,11 @@
       </w:r>
       <w:r>
         <w:tab/>
-        <w:t>Hari/</w:t>
-      </w:r>
-      <w:proofErr w:type="spellStart"/>
-      <w:r>
-        <w:t>Tgl</w:t>
-      </w:r>
-      <w:proofErr w:type="spellEnd"/>
-      <w:r>
-        <w:tab/>
-        <w:t>: {{</w:t>
-      </w:r>
-      <w:proofErr w:type="spellStart"/>
-      <w:r>
-        <w:t>hari</w:t>
-      </w:r>
-      <w:proofErr w:type="spellEnd"/>
-      <w:r>
-        <w:t>}}, {{</w:t>
-      </w:r>
-      <w:proofErr w:type="spellStart"/>
-      <w:r>
-        <w:t>tgl</w:t>
-      </w:r>
-      <w:proofErr w:type="spellEnd"/>
-      <w:r>
-        <w:t>}}</w:t>
+        <w:t>Hari/Tgl</w:t>
+      </w:r>
+      <w:r>
+        <w:tab/>
+        <w:t>: {{hari}}, {{tgl}}</w:t>
       </w:r>
     </w:p>
     <w:p>
@@ -4941,15 +4536,7 @@
       </w:r>
       <w:r>
         <w:tab/>
-        <w:t xml:space="preserve"> : {{</w:t>
-      </w:r>
-      <w:proofErr w:type="spellStart"/>
-      <w:r>
-        <w:t>npm</w:t>
-      </w:r>
-      <w:proofErr w:type="spellEnd"/>
-      <w:r>
-        <w:t>}}</w:t>
+        <w:t xml:space="preserve"> : {{npm}}</w:t>
       </w:r>
       <w:r>
         <w:tab/>
@@ -4960,21 +4547,8 @@
       </w:r>
       <w:r>
         <w:tab/>
-        <w:t xml:space="preserve">: {{jam}} </w:t>
-      </w:r>
-      <w:proofErr w:type="spellStart"/>
-      <w:r>
-        <w:t>Wib</w:t>
-      </w:r>
-      <w:proofErr w:type="spellEnd"/>
-      <w:r>
-        <w:t xml:space="preserve"> s/d </w:t>
-      </w:r>
-      <w:proofErr w:type="spellStart"/>
-      <w:r>
-        <w:t>selesai</w:t>
-      </w:r>
-      <w:proofErr w:type="spellEnd"/>
+        <w:t>: {{jam}} Wib s/d selesai</w:t>
+      </w:r>
     </w:p>
     <w:p>
       <w:pPr>
@@ -4995,13 +4569,8 @@
           <w:lang w:val="es-ES"/>
         </w:rPr>
       </w:pPr>
-      <w:proofErr w:type="spellStart"/>
-      <w:r>
-        <w:t>Judul</w:t>
-      </w:r>
-      <w:proofErr w:type="spellEnd"/>
-      <w:r>
-        <w:t xml:space="preserve">      </w:t>
+      <w:r>
+        <w:t xml:space="preserve">Judul      </w:t>
       </w:r>
       <w:r>
         <w:tab/>
@@ -5011,21 +4580,7 @@
         <w:rPr>
           <w:lang w:val="es-ES"/>
         </w:rPr>
-        <w:t>{{</w:t>
-      </w:r>
-      <w:proofErr w:type="spellStart"/>
-      <w:r>
-        <w:rPr>
-          <w:lang w:val="es-ES"/>
-        </w:rPr>
-        <w:t>judul</w:t>
-      </w:r>
-      <w:proofErr w:type="spellEnd"/>
-      <w:r>
-        <w:rPr>
-          <w:lang w:val="es-ES"/>
-        </w:rPr>
-        <w:t>}}</w:t>
+        <w:t>{{judul}}</w:t>
       </w:r>
     </w:p>
     <w:p>
@@ -5143,62 +4698,42 @@
           </w:p>
           <w:p>
             <w:pPr>
-              <w:jc w:val="center"/>
-            </w:pPr>
-          </w:p>
-          <w:p>
-            <w:pPr>
-              <w:jc w:val="center"/>
               <w:rPr>
                 <w:lang w:val="id-ID"/>
               </w:rPr>
             </w:pPr>
-            <w:r>
-              <w:t>3.</w:t>
-            </w:r>
-          </w:p>
-          <w:p>
-            <w:pPr>
-              <w:jc w:val="center"/>
+          </w:p>
+        </w:tc>
+        <w:tc>
+          <w:tcPr>
+            <w:tcW w:w="5400" w:type="dxa"/>
+          </w:tcPr>
+          <w:p>
+            <w:pPr>
+              <w:jc w:val="both"/>
+            </w:pPr>
+          </w:p>
+          <w:p>
+            <w:pPr>
+              <w:ind w:hanging="18"/>
+            </w:pPr>
+            <w:r>
+              <w:t>{{doji1}}</w:t>
+            </w:r>
+          </w:p>
+          <w:p/>
+          <w:p>
+            <w:r>
+              <w:t>{{doji2}}</w:t>
+            </w:r>
+          </w:p>
+          <w:p/>
+          <w:p>
+            <w:pPr>
               <w:rPr>
                 <w:lang w:val="id-ID"/>
               </w:rPr>
             </w:pPr>
-          </w:p>
-        </w:tc>
-        <w:tc>
-          <w:tcPr>
-            <w:tcW w:w="5400" w:type="dxa"/>
-          </w:tcPr>
-          <w:p>
-            <w:pPr>
-              <w:jc w:val="both"/>
-            </w:pPr>
-          </w:p>
-          <w:p>
-            <w:pPr>
-              <w:ind w:hanging="18"/>
-            </w:pPr>
-            <w:r>
-              <w:t>{{doji1}}</w:t>
-            </w:r>
-          </w:p>
-          <w:p/>
-          <w:p>
-            <w:r>
-              <w:t>{{doji2}}</w:t>
-            </w:r>
-          </w:p>
-          <w:p/>
-          <w:p>
-            <w:pPr>
-              <w:rPr>
-                <w:lang w:val="id-ID"/>
-              </w:rPr>
-            </w:pPr>
-            <w:r>
-              <w:t>{{doji3}}</w:t>
-            </w:r>
           </w:p>
         </w:tc>
         <w:tc>
@@ -5234,13 +4769,8 @@
             <w:pPr>
               <w:pStyle w:val="Heading3"/>
             </w:pPr>
-            <w:proofErr w:type="spellStart"/>
-            <w:r>
-              <w:t>Jumlah</w:t>
-            </w:r>
-            <w:proofErr w:type="spellEnd"/>
-            <w:r>
-              <w:t xml:space="preserve"> Skor</w:t>
+            <w:r>
+              <w:t>Jumlah Skor</w:t>
             </w:r>
           </w:p>
         </w:tc>
@@ -5272,21 +4802,8 @@
     </w:p>
     <w:p/>
     <w:p>
-      <w:proofErr w:type="spellStart"/>
-      <w:r>
-        <w:t>Catatan</w:t>
-      </w:r>
-      <w:proofErr w:type="spellEnd"/>
-      <w:r>
-        <w:t xml:space="preserve"> </w:t>
-      </w:r>
-      <w:proofErr w:type="spellStart"/>
-      <w:r>
-        <w:t>Penting</w:t>
-      </w:r>
-      <w:proofErr w:type="spellEnd"/>
-      <w:r>
-        <w:t xml:space="preserve"> :</w:t>
+      <w:r>
+        <w:t>Catatan Penting :</w:t>
       </w:r>
       <w:r>
         <w:tab/>
@@ -5324,13 +4841,8 @@
           <w:lang w:val="id-ID"/>
         </w:rPr>
       </w:pPr>
-      <w:proofErr w:type="spellStart"/>
-      <w:r>
-        <w:t>Keterangan</w:t>
-      </w:r>
-      <w:proofErr w:type="spellEnd"/>
-      <w:r>
-        <w:t xml:space="preserve"> Jlh Skor :</w:t>
+      <w:r>
+        <w:t>Keterangan Jlh Skor :</w:t>
       </w:r>
       <w:r>
         <w:tab/>
@@ -5702,43 +5214,7 @@
           <w:lang w:val="id-ID"/>
         </w:rPr>
         <w:tab/>
-        <w:t xml:space="preserve">          </w:t>
-      </w:r>
-      <w:proofErr w:type="spellStart"/>
-      <w:r>
-        <w:rPr>
-          <w:sz w:val="22"/>
-          <w:szCs w:val="22"/>
-          <w:lang w:val="id-ID"/>
-        </w:rPr>
-        <w:t>apt</w:t>
-      </w:r>
-      <w:proofErr w:type="spellEnd"/>
-      <w:r>
-        <w:rPr>
-          <w:sz w:val="22"/>
-          <w:szCs w:val="22"/>
-          <w:lang w:val="id-ID"/>
-        </w:rPr>
-        <w:t xml:space="preserve">. Haris Munandar Nasution, </w:t>
-      </w:r>
-      <w:proofErr w:type="spellStart"/>
-      <w:r>
-        <w:rPr>
-          <w:sz w:val="22"/>
-          <w:szCs w:val="22"/>
-          <w:lang w:val="id-ID"/>
-        </w:rPr>
-        <w:t>S.Farm</w:t>
-      </w:r>
-      <w:proofErr w:type="spellEnd"/>
-      <w:r>
-        <w:rPr>
-          <w:sz w:val="22"/>
-          <w:szCs w:val="22"/>
-          <w:lang w:val="id-ID"/>
-        </w:rPr>
-        <w:t>., M.Si.</w:t>
+        <w:t xml:space="preserve">          apt. Haris Munandar Nasution, S.Farm., M.Si.</w:t>
       </w:r>
     </w:p>
     <w:p>
@@ -5948,6 +5424,13 @@
     <w:p/>
     <w:p/>
     <w:p/>
+    <w:p>
+      <w:pPr>
+        <w:rPr>
+          <w:lang w:val="id-ID"/>
+        </w:rPr>
+      </w:pPr>
+    </w:p>
     <w:p>
       <w:pPr>
         <w:rPr>
@@ -6268,21 +5751,7 @@
         <w:rPr>
           <w:lang w:val="id-ID"/>
         </w:rPr>
-        <w:t xml:space="preserve">Pada hari ini .................. tanggal ............................. bulan............................... tahun ................. bertempat di ruang sidang Farmasi Universitas Muslim Nusantara Al </w:t>
-      </w:r>
-      <w:proofErr w:type="spellStart"/>
-      <w:r>
-        <w:rPr>
-          <w:lang w:val="id-ID"/>
-        </w:rPr>
-        <w:t>Washliyah</w:t>
-      </w:r>
-      <w:proofErr w:type="spellEnd"/>
-      <w:r>
-        <w:rPr>
-          <w:lang w:val="id-ID"/>
-        </w:rPr>
-        <w:t>, ketiga penguji setelah :</w:t>
+        <w:t>Pada hari ini .................. tanggal ............................. bulan............................... tahun ................. bertempat di ruang sidang Farmasi Universitas Muslim Nusantara Al Washliyah, ketiga penguji setelah :</w:t>
       </w:r>
     </w:p>
     <w:p>
@@ -6311,16 +5780,8 @@
           <w:lang w:val="id-ID"/>
         </w:rPr>
         <w:tab/>
-        <w:t>-</w:t>
-      </w:r>
-      <w:proofErr w:type="spellStart"/>
-      <w:r>
-        <w:rPr>
-          <w:lang w:val="id-ID"/>
-        </w:rPr>
-        <w:t>dst</w:t>
-      </w:r>
-      <w:proofErr w:type="spellEnd"/>
+        <w:t>-dst</w:t>
+      </w:r>
     </w:p>
     <w:p>
       <w:pPr>
@@ -6348,16 +5809,8 @@
           <w:lang w:val="id-ID"/>
         </w:rPr>
         <w:tab/>
-        <w:t>-</w:t>
-      </w:r>
-      <w:proofErr w:type="spellStart"/>
-      <w:r>
-        <w:rPr>
-          <w:lang w:val="id-ID"/>
-        </w:rPr>
-        <w:t>dst</w:t>
-      </w:r>
-      <w:proofErr w:type="spellEnd"/>
+        <w:t>-dst</w:t>
+      </w:r>
     </w:p>
     <w:p>
       <w:pPr>
@@ -6379,16 +5832,8 @@
           <w:lang w:val="id-ID"/>
         </w:rPr>
         <w:tab/>
-        <w:t>-</w:t>
-      </w:r>
-      <w:proofErr w:type="spellStart"/>
-      <w:r>
-        <w:rPr>
-          <w:lang w:val="id-ID"/>
-        </w:rPr>
-        <w:t>dst</w:t>
-      </w:r>
-      <w:proofErr w:type="spellEnd"/>
+        <w:t>-dst</w:t>
+      </w:r>
     </w:p>
     <w:p>
       <w:pPr>
@@ -6416,16 +5861,8 @@
           <w:lang w:val="id-ID"/>
         </w:rPr>
         <w:tab/>
-        <w:t>-</w:t>
-      </w:r>
-      <w:proofErr w:type="spellStart"/>
-      <w:r>
-        <w:rPr>
-          <w:lang w:val="id-ID"/>
-        </w:rPr>
-        <w:t>dst</w:t>
-      </w:r>
-      <w:proofErr w:type="spellEnd"/>
+        <w:t>-dst</w:t>
+      </w:r>
     </w:p>
     <w:p>
       <w:pPr>
@@ -6531,13 +5968,8 @@
           <w:lang w:val="es-ES"/>
         </w:rPr>
       </w:pPr>
-      <w:proofErr w:type="spellStart"/>
-      <w:r>
-        <w:t>Judul</w:t>
-      </w:r>
-      <w:proofErr w:type="spellEnd"/>
-      <w:r>
-        <w:t xml:space="preserve">      </w:t>
+      <w:r>
+        <w:t xml:space="preserve">Judul      </w:t>
       </w:r>
       <w:r>
         <w:tab/>
@@ -6867,23 +6299,7 @@
           <w:lang w:val="id-ID"/>
         </w:rPr>
         <w:tab/>
-        <w:t xml:space="preserve">Ka. </w:t>
-      </w:r>
-      <w:proofErr w:type="spellStart"/>
-      <w:r>
-        <w:rPr>
-          <w:spacing w:val="-8"/>
-          <w:lang w:val="id-ID"/>
-        </w:rPr>
-        <w:t>Prodi</w:t>
-      </w:r>
-      <w:proofErr w:type="spellEnd"/>
-      <w:r>
-        <w:rPr>
-          <w:spacing w:val="-8"/>
-          <w:lang w:val="id-ID"/>
-        </w:rPr>
-        <w:t>,</w:t>
+        <w:t>Ka. Prodi,</w:t>
       </w:r>
     </w:p>
     <w:p>
@@ -6929,19 +6345,11 @@
           <w:lang w:val="id-ID"/>
         </w:rPr>
       </w:pPr>
-      <w:proofErr w:type="spellStart"/>
-      <w:r>
-        <w:rPr>
-          <w:lang w:val="id-ID"/>
-        </w:rPr>
-        <w:t>apt</w:t>
-      </w:r>
-      <w:proofErr w:type="spellEnd"/>
-      <w:r>
-        <w:rPr>
-          <w:lang w:val="id-ID"/>
-        </w:rPr>
-        <w:t xml:space="preserve">. </w:t>
+      <w:r>
+        <w:rPr>
+          <w:lang w:val="id-ID"/>
+        </w:rPr>
+        <w:t xml:space="preserve">apt. </w:t>
       </w:r>
       <w:r>
         <w:rPr>
@@ -6953,30 +6361,8 @@
         <w:rPr>
           <w:lang w:val="id-ID"/>
         </w:rPr>
-        <w:t>a Sari Lubis, S.</w:t>
-      </w:r>
-      <w:proofErr w:type="spellStart"/>
-      <w:r>
-        <w:rPr>
-          <w:lang w:val="id-ID"/>
-        </w:rPr>
-        <w:t>Farm</w:t>
-      </w:r>
-      <w:proofErr w:type="spellEnd"/>
-      <w:r>
-        <w:rPr>
-          <w:lang w:val="id-ID"/>
-        </w:rPr>
-        <w:t>.,</w:t>
-      </w:r>
-      <w:proofErr w:type="spellStart"/>
-      <w:r>
-        <w:rPr>
-          <w:lang w:val="id-ID"/>
-        </w:rPr>
-        <w:t>M.Si</w:t>
-      </w:r>
-      <w:proofErr w:type="spellEnd"/>
+        <w:t>a Sari Lubis, S.Farm.,M.Si</w:t>
+      </w:r>
       <w:r>
         <w:rPr>
           <w:lang w:val="id-ID"/>
@@ -7185,32 +6571,11 @@
       </w:r>
       <w:r>
         <w:tab/>
-        <w:t>Hari/</w:t>
-      </w:r>
-      <w:proofErr w:type="spellStart"/>
-      <w:r>
-        <w:t>Tgl</w:t>
-      </w:r>
-      <w:proofErr w:type="spellEnd"/>
-      <w:r>
-        <w:tab/>
-        <w:t>: {{</w:t>
-      </w:r>
-      <w:proofErr w:type="spellStart"/>
-      <w:r>
-        <w:t>hari</w:t>
-      </w:r>
-      <w:proofErr w:type="spellEnd"/>
-      <w:r>
-        <w:t>}}, {{</w:t>
-      </w:r>
-      <w:proofErr w:type="spellStart"/>
-      <w:r>
-        <w:t>tgl</w:t>
-      </w:r>
-      <w:proofErr w:type="spellEnd"/>
-      <w:r>
-        <w:t>}}</w:t>
+        <w:t>Hari/Tgl</w:t>
+      </w:r>
+      <w:r>
+        <w:tab/>
+        <w:t>: {{hari}}, {{tgl}}</w:t>
       </w:r>
     </w:p>
     <w:p>
@@ -7235,15 +6600,7 @@
       </w:r>
       <w:r>
         <w:tab/>
-        <w:t xml:space="preserve"> : {{</w:t>
-      </w:r>
-      <w:proofErr w:type="spellStart"/>
-      <w:r>
-        <w:t>npm</w:t>
-      </w:r>
-      <w:proofErr w:type="spellEnd"/>
-      <w:r>
-        <w:t>}}</w:t>
+        <w:t xml:space="preserve"> : {{npm}}</w:t>
       </w:r>
       <w:r>
         <w:tab/>
@@ -7254,21 +6611,8 @@
       </w:r>
       <w:r>
         <w:tab/>
-        <w:t xml:space="preserve">: {{jam}} </w:t>
-      </w:r>
-      <w:proofErr w:type="spellStart"/>
-      <w:r>
-        <w:t>Wib</w:t>
-      </w:r>
-      <w:proofErr w:type="spellEnd"/>
-      <w:r>
-        <w:t xml:space="preserve"> s/d </w:t>
-      </w:r>
-      <w:proofErr w:type="spellStart"/>
-      <w:r>
-        <w:t>selesai</w:t>
-      </w:r>
-      <w:proofErr w:type="spellEnd"/>
+        <w:t>: {{jam}} Wib s/d selesai</w:t>
+      </w:r>
     </w:p>
     <w:p>
       <w:pPr>

</xml_diff>